<commit_message>
Re-check rendering to make sure everyting runs fine after making these changes.
</commit_message>
<xml_diff>
--- a/docs/results.docx
+++ b/docs/results.docx
@@ -2,6 +2,29 @@
 <file path=word/document.xml><?xml version="1.0" encoding="utf-8"?>
 <w:document xmlns:w="http://schemas.openxmlformats.org/wordprocessingml/2006/main" xmlns:m="http://schemas.openxmlformats.org/officeDocument/2006/math" xmlns:r="http://schemas.openxmlformats.org/officeDocument/2006/relationships" xmlns:o="urn:schemas-microsoft-com:office:office" xmlns:v="urn:schemas-microsoft-com:vml" xmlns:w10="urn:schemas-microsoft-com:office:word" xmlns:a="http://schemas.openxmlformats.org/drawingml/2006/main" xmlns:pic="http://schemas.openxmlformats.org/drawingml/2006/picture" xmlns:wp="http://schemas.openxmlformats.org/drawingml/2006/wordprocessingDrawing">
   <w:body>
+    <w:p>
+      <w:pPr>
+        <w:pStyle w:val="SourceCode"/>
+      </w:pPr>
+      <w:r>
+        <w:br/>
+      </w:r>
+      <w:r>
+        <w:rPr>
+          <w:rStyle w:val="VerbatimChar"/>
+        </w:rPr>
+        <w:t xml:space="preserve">The downloaded binary packages are in</w:t>
+      </w:r>
+      <w:r>
+        <w:br/>
+      </w:r>
+      <w:r>
+        <w:rPr>
+          <w:rStyle w:val="VerbatimChar"/>
+        </w:rPr>
+        <w:t xml:space="preserve">    /var/folders/48/07fr3p6n4nv8gq_s3kl6vj2c0000gn/T//RtmpDQfvdr/downloaded_packages</w:t>
+      </w:r>
+    </w:p>
     <w:p>
       <w:pPr>
         <w:pStyle w:val="SourceCode"/>
@@ -701,7 +724,7 @@
         <w:t xml:space="preserve"> </w:t>
       </w:r>
       <w:r>
-        <w:t xml:space="preserve">package in R (vers. 3.1.0)</w:t>
+        <w:t xml:space="preserve">package in R (vers. 3.1.1)</w:t>
       </w:r>
       <w:r>
         <w:t xml:space="preserve"> </w:t>
@@ -3954,7 +3977,7 @@
             <w:r>
               <w:drawing>
                 <wp:inline>
-                  <wp:extent cx="6680200" cy="3954477"/>
+                  <wp:extent cx="6680200" cy="4316757"/>
                   <wp:effectExtent b="0" l="0" r="0" t="0"/>
                   <wp:docPr descr="" title="" id="32" name="Picture"/>
                   <a:graphic>
@@ -3975,7 +3998,7 @@
                         <pic:spPr bwMode="auto">
                           <a:xfrm>
                             <a:off x="0" y="0"/>
-                            <a:ext cx="6680200" cy="3954477"/>
+                            <a:ext cx="6680200" cy="4316757"/>
                           </a:xfrm>
                           <a:prstGeom prst="rect">
                             <a:avLst/>
@@ -4819,7 +4842,7 @@
             <w:r>
               <w:drawing>
                 <wp:inline>
-                  <wp:extent cx="6680200" cy="4473624"/>
+                  <wp:extent cx="6680200" cy="4700154"/>
                   <wp:effectExtent b="0" l="0" r="0" t="0"/>
                   <wp:docPr descr="" title="" id="36" name="Picture"/>
                   <a:graphic>
@@ -4840,7 +4863,7 @@
                         <pic:spPr bwMode="auto">
                           <a:xfrm>
                             <a:off x="0" y="0"/>
-                            <a:ext cx="6680200" cy="4473624"/>
+                            <a:ext cx="6680200" cy="4700154"/>
                           </a:xfrm>
                           <a:prstGeom prst="rect">
                             <a:avLst/>
@@ -5253,7 +5276,7 @@
         <w:t xml:space="preserve"> </w:t>
       </w:r>
       <w:r>
-        <w:t xml:space="preserve">= 0) and oxidative damage (</w:t>
+        <w:t xml:space="preserve">= 0), oxidative damage (</w:t>
       </w:r>
       <m:oMath>
         <m:r>
@@ -5293,7 +5316,47 @@
         <w:t xml:space="preserve"> </w:t>
       </w:r>
       <w:r>
-        <w:t xml:space="preserve">= 0.03). While metabolic capacity was also supressed overall, it was not significantly different from zero (</w:t>
+        <w:t xml:space="preserve">= 0.03) and oxidative stress (</w:t>
+      </w:r>
+      <m:oMath>
+        <m:r>
+          <m:t>S</m:t>
+        </m:r>
+        <m:r>
+          <m:t>M</m:t>
+        </m:r>
+        <m:sSub>
+          <m:e>
+            <m:r>
+              <m:t>D</m:t>
+            </m:r>
+          </m:e>
+          <m:sub>
+            <m:r>
+              <m:t>H</m:t>
+            </m:r>
+          </m:sub>
+        </m:sSub>
+      </m:oMath>
+      <w:r>
+        <w:t xml:space="preserve"> </w:t>
+      </w:r>
+      <w:r>
+        <w:t xml:space="preserve">= -1.41, 95% CI: -2.49 to -0.34,</w:t>
+      </w:r>
+      <w:r>
+        <w:t xml:space="preserve"> </w:t>
+      </w:r>
+      <m:oMath>
+        <m:r>
+          <m:t>p</m:t>
+        </m:r>
+      </m:oMath>
+      <w:r>
+        <w:t xml:space="preserve"> </w:t>
+      </w:r>
+      <w:r>
+        <w:t xml:space="preserve">= 0.01). While metabolic capacity was also supressed overall, it was not significantly different from zero (</w:t>
       </w:r>
       <m:oMath>
         <m:r>
@@ -5372,7 +5435,7 @@
             <w:r>
               <w:drawing>
                 <wp:inline>
-                  <wp:extent cx="6680200" cy="2439513"/>
+                  <wp:extent cx="6680200" cy="2408624"/>
                   <wp:effectExtent b="0" l="0" r="0" t="0"/>
                   <wp:docPr descr="" title="" id="41" name="Picture"/>
                   <a:graphic>
@@ -5393,7 +5456,7 @@
                         <pic:spPr bwMode="auto">
                           <a:xfrm>
                             <a:off x="0" y="0"/>
-                            <a:ext cx="6680200" cy="2439513"/>
+                            <a:ext cx="6680200" cy="2408624"/>
                           </a:xfrm>
                           <a:prstGeom prst="rect">
                             <a:avLst/>
@@ -6159,7 +6222,7 @@
             <w:r>
               <w:drawing>
                 <wp:inline>
-                  <wp:extent cx="6680200" cy="2169763"/>
+                  <wp:extent cx="6680200" cy="2405463"/>
                   <wp:effectExtent b="0" l="0" r="0" t="0"/>
                   <wp:docPr descr="" title="" id="46" name="Picture"/>
                   <a:graphic>
@@ -6180,7 +6243,7 @@
                         <pic:spPr bwMode="auto">
                           <a:xfrm>
                             <a:off x="0" y="0"/>
-                            <a:ext cx="6680200" cy="2169763"/>
+                            <a:ext cx="6680200" cy="2405463"/>
                           </a:xfrm>
                           <a:prstGeom prst="rect">
                             <a:avLst/>
@@ -7030,7 +7093,7 @@
             <w:r>
               <w:drawing>
                 <wp:inline>
-                  <wp:extent cx="6680200" cy="2969853"/>
+                  <wp:extent cx="6680200" cy="3020294"/>
                   <wp:effectExtent b="0" l="0" r="0" t="0"/>
                   <wp:docPr descr="" title="" id="55" name="Picture"/>
                   <a:graphic>
@@ -7051,7 +7114,7 @@
                         <pic:spPr bwMode="auto">
                           <a:xfrm>
                             <a:off x="0" y="0"/>
-                            <a:ext cx="6680200" cy="2969853"/>
+                            <a:ext cx="6680200" cy="3020294"/>
                           </a:xfrm>
                           <a:prstGeom prst="rect">
                             <a:avLst/>

</xml_diff>